<commit_message>
NDA: Dr. Wilke als Vertreter eingetragen, interner Hinweis entfernt
- biotec wird durch Dr. Thomas Wilke, CEO, vertreten - in der Parteientabelle
  und im Unterschriftsfeld
- Der Hinweisblock am Dokumentende ist entfernt; das Dokument ist damit ohne
  Nachbearbeitung versandfertig
- Nicht mehr benoetigte Importe aufgeraeumt

Der Vorbehalt zur juristischen Pruefung und die Begruendung der Rechtswahl
stehen weiterhin im Skriptkopf und in 04_Kundendokumente/README.md.

Co-Authored-By: Claude Opus 5 <noreply@anthropic.com>
Claude-Session: https://claude.ai/code/session_01GFfZvJBCzXCmDgx3EnU1YB
</commit_message>
<xml_diff>
--- a/04_Kundendokumente/NDA_CertoClav_biotec.docx
+++ b/04_Kundendokumente/NDA_CertoClav_biotec.docx
@@ -126,7 +126,7 @@
               <w:br/>
               <w:t>Telefon +49 5241 307200 · info@biotec-gmbh.com</w:t>
               <w:br/>
-              <w:t>vertreten durch: ______________________________</w:t>
+              <w:t>vertreten durch: Dr. Thomas Wilke, CEO</w:t>
             </w:r>
           </w:p>
         </w:tc>
@@ -1093,7 +1093,9 @@
               <w:br/>
               <w:t>________________________________</w:t>
               <w:br/>
-              <w:t>Name, Funktion</w:t>
+              <w:t>Dr. Thomas Wilke</w:t>
+              <w:br/>
+              <w:t>CEO</w:t>
             </w:r>
           </w:p>
         </w:tc>
@@ -1127,35 +1129,6 @@
         </w:tc>
       </w:tr>
     </w:tbl>
-    <w:p>
-      <w:pPr>
-        <w:spacing w:before="320"/>
-        <w:pBdr>
-          <w:bottom w:val="single" w:sz="6" w:space="2" w:color="BFBFBF"/>
-        </w:pBdr>
-      </w:pPr>
-      <w:r>
-        <w:rPr>
-          <w:b/>
-          <w:color w:val="7F7F7F"/>
-          <w:sz w:val="16"/>
-        </w:rPr>
-        <w:t>Hinweis für den internen Gebrauch</w:t>
-      </w:r>
-    </w:p>
-    <w:p>
-      <w:pPr>
-        <w:spacing w:after="40"/>
-      </w:pPr>
-      <w:r>
-        <w:rPr>
-          <w:i/>
-          <w:color w:val="7F7F7F"/>
-          <w:sz w:val="18"/>
-        </w:rPr>
-        <w:t>Diese Vereinbarung ist eine Vorlage und keine Rechtsberatung. Vor Verwendung juristisch prüfen lassen. Vorbelegt sind deutsches Recht und Gerichtsstand Gütersloh, weil biotec die hauptsächlich offenbarende Partei ist – das erleichtert die Zeichnung auf Kundenseite. Alternative: österreichisches Recht, Gerichtsstand Linz. Diesen Hinweis vor dem Versand löschen.</w:t>
-      </w:r>
-    </w:p>
     <w:sectPr>
       <w:headerReference w:type="default" r:id="rId9"/>
       <w:footerReference w:type="default" r:id="rId10"/>

</xml_diff>

<commit_message>
NDA Version 2: Registerdaten und Versionskennzeichnung, Antwortentwurf
Aus der Signatur von Nicole Krupa bestaetigt und uebernommen:
Geschaeftsfuehrer Dr. Thomas Wilke, Prokurist Dr. Andreas Bermpohl,
Amtsgericht Guetersloh HRB 3829, Telefon +49 5241 307 20-0.

- NDA traegt jetzt "Version 2, Stand 19.08.2026" in Titel und Kopfzeile und
  enthaelt die Registerdaten von biotec in der Parteientabelle
- Offene Frage 55 beantwortet: "Prokurist" ist korrekt
- beteiligte-und-rollen.md um die Registerdaten ergaenzt; Wilke ist laut
  Handelsregister Geschaeftsfuehrer, nicht CEO
- Antwortentwurf 2026-08-19_email-antwort-nda-version2.md, sprachlich geglaettet
  (fehlende Kommas, "bearbieten"), mit optionalem Zusatz zum AV-Vertrag
- Entscheidung festgehalten: keine Anonymisierung der Rohdaten, biotec laedt
  unveraendert hoch. Der AV-Vertrag bleibt nachzuziehen

Co-Authored-By: Claude Opus 5 <noreply@anthropic.com>
Claude-Session: https://claude.ai/code/session_01GFfZvJBCzXCmDgx3EnU1YB
</commit_message>
<xml_diff>
--- a/04_Kundendokumente/NDA_CertoClav_biotec.docx
+++ b/04_Kundendokumente/NDA_CertoClav_biotec.docx
@@ -24,7 +24,7 @@
           <w:color w:val="7F7F7F"/>
           <w:sz w:val="22"/>
         </w:rPr>
-        <w:t>Gegenseitige Vereinbarung über die Behandlung vertraulicher Informationen</w:t>
+        <w:t>Gegenseitige Vereinbarung über die Behandlung vertraulicher Informationen  ·  Version 2, Stand 19.08.2026</w:t>
       </w:r>
     </w:p>
     <w:p>
@@ -126,7 +126,9 @@
               </w:rPr>
               <w:t>Elbrachtsweg 76, 33332 Gütersloh, Deutschland</w:t>
               <w:br/>
-              <w:t>Telefon +49 5241 307200 · info@biotec-gmbh.com</w:t>
+              <w:t>Telefon +49 5241 307 20-0 · info@biotec-gmbh.com</w:t>
+              <w:br/>
+              <w:t>Amtsgericht Gütersloh, HRB 3829</w:t>
               <w:br/>
               <w:t>vertreten durch: Dr. Andreas Bermpohl, Prokurist</w:t>
             </w:r>
@@ -1297,7 +1299,7 @@
         <w:sz w:val="16"/>
       </w:rPr>
       <w:tab/>
-      <w:t>Vertraulichkeitsvereinbarung  ·  Dok.-Nr. NDA-2026-001</w:t>
+      <w:t>Vertraulichkeitsvereinbarung  ·  Dok.-Nr. NDA-2026-001  ·  Version 2</w:t>
     </w:r>
   </w:p>
 </w:hdr>

</xml_diff>